<commit_message>
Finish FO Assign form polish and Import CSV wiring
</commit_message>
<xml_diff>
--- a/Request Process Flow Documentation..docx
+++ b/Request Process Flow Documentation..docx
@@ -103,13 +103,22 @@
     </w:p>
     <w:p>
       <w:pPr>
-        <w:rPr/>
-      </w:pPr>
-      <w:r>
-        <w:rPr>
-          <w:rtl w:val="0"/>
-        </w:rPr>
-        <w:t xml:space="preserve"> * UI Component: A dropdown menu labeled "Select Truck Type" with the following options: Full, Semi, Flat, Side Guide, Low Bed.</w:t>
+        <w:rPr>
+          <w:highlight w:val="yellow"/>
+        </w:rPr>
+      </w:pPr>
+      <w:r>
+        <w:rPr>
+          <w:rtl w:val="0"/>
+        </w:rPr>
+        <w:t xml:space="preserve"> * UI Component: A dropdown menu labeled "Select Truck Type" with the following options: </w:t>
+      </w:r>
+      <w:r>
+        <w:rPr>
+          <w:highlight w:val="yellow"/>
+          <w:rtl w:val="0"/>
+        </w:rPr>
+        <w:t xml:space="preserve">Full Sided, Semi Sided, Flat, Side Guide, Low Bed, 6 Meter Truck, 8 Meter Truck and Pick Up</w:t>
       </w:r>
     </w:p>
     <w:p>
@@ -142,7 +151,7 @@
         <w:rPr>
           <w:rtl w:val="0"/>
         </w:rPr>
-        <w:t xml:space="preserve"> * UI Component: Text input field labeled "Customer Name / Consignee".</w:t>
+        <w:t xml:space="preserve"> * UI Component: Text input field labeled "Customer Name ".</w:t>
       </w:r>
     </w:p>
     <w:p>
@@ -387,7 +396,7 @@
           <w:szCs w:val="26"/>
         </w:rPr>
       </w:pPr>
-      <w:bookmarkStart w:colFirst="0" w:colLast="0" w:name="_c2ixjxur0zkm" w:id="0"/>
+      <w:bookmarkStart w:colFirst="0" w:colLast="0" w:name="_heading=h.ntq9croqlm1c" w:id="0"/>
       <w:bookmarkEnd w:id="0"/>
       <w:r>
         <w:rPr>
@@ -2327,6 +2336,20 @@
       <w:sz w:val="52"/>
       <w:szCs w:val="52"/>
     </w:rPr>
+  </w:style>
+  <w:style w:type="table" w:styleId="TableNormal" w:default="1">
+    <w:name w:val="TableNormal"/>
+    <w:tblPr>
+      <w:tblCellMar>
+        <w:top w:w="100.0" w:type="dxa"/>
+        <w:left w:w="100.0" w:type="dxa"/>
+        <w:bottom w:w="100.0" w:type="dxa"/>
+        <w:right w:w="100.0" w:type="dxa"/>
+      </w:tblCellMar>
+    </w:tblPr>
+  </w:style>
+  <w:style w:type="paragraph" w:styleId="Normal" w:default="1">
+    <w:name w:val="normal"/>
   </w:style>
   <w:style w:type="paragraph" w:styleId="Subtitle">
     <w:name w:val="Subtitle"/>
@@ -2668,4 +2691,19 @@
   </a:objectDefaults>
   <a:extraClrSchemeLst/>
 </a:theme>
+</file>
+
+<file path=customXML/item1.xml><?xml version="1.0" encoding="utf-8"?>
+<go:gDocsCustomXmlDataStorage xmlns:go="http://customooxmlschemas.google.com/" xmlns:r="http://schemas.openxmlformats.org/officeDocument/2006/relationships" uri="GoogleDocsCustomDataVersion2">
+  <go:docsCustomData xmlns:go="http://customooxmlschemas.google.com/" roundtripDataSignature="AMtx7mjfO/RkDSVlbuaApL48glg3gmCxVw==">CgMxLjAyDmgubnRxOWNyb3FsbTFjOAByITFtQ1JSQl90V291QkVXeWI0eUx1MWtONW00aTl4VF9URQ==</go:docsCustomData>
+</go:gDocsCustomXmlDataStorage>
+</file>
+
+<file path=customXML/itemProps1.xml><?xml version="1.0" encoding="utf-8"?>
+<ds:datastoreItem xmlns:ds="http://schemas.openxmlformats.org/officeDocument/2006/customXml" ds:itemID="{11111111-1234-1234-1234-123412341234}">
+  <ds:schemaRefs>
+    <ds:schemaRef ds:uri="http://schemas.openxmlformats.org/officeDocument/2006/relationships"/>
+    <ds:schemaRef ds:uri="http://customooxmlschemas.google.com/"/>
+  </ds:schemaRefs>
+</ds:datastoreItem>
 </file>
</xml_diff>